<commit_message>
added picks for dependents vs yourself
</commit_message>
<xml_diff>
--- a/a3/Report (2).docx
+++ b/a3/Report (2).docx
@@ -386,21 +386,7 @@
               <w:rPr>
                 <w:u w:val="single"/>
               </w:rPr>
-              <w:t>Ensure that more professional and relevant language is used for these types of things (</w:t>
-            </w:r>
-            <w:proofErr w:type="spellStart"/>
-            <w:r>
-              <w:rPr>
-                <w:u w:val="single"/>
-              </w:rPr>
-              <w:t>ie</w:t>
-            </w:r>
-            <w:proofErr w:type="spellEnd"/>
-            <w:r>
-              <w:rPr>
-                <w:u w:val="single"/>
-              </w:rPr>
-              <w:t>, the Nav)</w:t>
+              <w:t>Ensure that more professional and relevant language is used for these types of things (ie, the Nav)</w:t>
             </w:r>
           </w:p>
         </w:tc>
@@ -1060,7 +1046,17 @@
           <w:tcPr>
             <w:tcW w:w="7338" w:type="dxa"/>
           </w:tcPr>
-          <w:p/>
+          <w:p>
+            <w:r>
+              <w:t>Have you used a site related to optometry in the past</w:t>
+            </w:r>
+            <w:r>
+              <w:t xml:space="preserve"> – what did it look like</w:t>
+            </w:r>
+            <w:r>
+              <w:t>?</w:t>
+            </w:r>
+          </w:p>
         </w:tc>
       </w:tr>
       <w:tr>
@@ -1078,7 +1074,11 @@
           <w:tcPr>
             <w:tcW w:w="7338" w:type="dxa"/>
           </w:tcPr>
-          <w:p/>
+          <w:p>
+            <w:r>
+              <w:t>What do you think of first when you imagine an optometry website?</w:t>
+            </w:r>
+          </w:p>
         </w:tc>
       </w:tr>
       <w:tr>
@@ -1096,7 +1096,11 @@
           <w:tcPr>
             <w:tcW w:w="7338" w:type="dxa"/>
           </w:tcPr>
-          <w:p/>
+          <w:p>
+            <w:r>
+              <w:t>What would make you more likely to go with a certain optometry provider?</w:t>
+            </w:r>
+          </w:p>
         </w:tc>
       </w:tr>
       <w:tr>
@@ -1191,15 +1195,7 @@
           </w:tcPr>
           <w:p>
             <w:r>
-              <w:t xml:space="preserve">Make a booking for tomorrow to get new </w:t>
-            </w:r>
-            <w:proofErr w:type="spellStart"/>
-            <w:r>
-              <w:t>bluelight</w:t>
-            </w:r>
-            <w:proofErr w:type="spellEnd"/>
-            <w:r>
-              <w:t xml:space="preserve"> glasses</w:t>
+              <w:t>Make a booking for tomorrow to get new bluelight glasses</w:t>
             </w:r>
           </w:p>
         </w:tc>
@@ -1261,7 +1257,7 @@
           </w:tcPr>
           <w:p>
             <w:r>
-              <w:t>Did the design of the site seem clean and clear?</w:t>
+              <w:t>Was the sites design simple enough?</w:t>
             </w:r>
           </w:p>
         </w:tc>
@@ -1290,7 +1286,23 @@
           <w:tcPr>
             <w:tcW w:w="7338" w:type="dxa"/>
           </w:tcPr>
-          <w:p/>
+          <w:p>
+            <w:r>
+              <w:t>Did the colour scheme</w:t>
+            </w:r>
+            <w:r>
+              <w:t xml:space="preserve"> and colours you saw</w:t>
+            </w:r>
+            <w:r>
+              <w:t xml:space="preserve"> </w:t>
+            </w:r>
+            <w:r>
+              <w:t>aid the site or make it more difficult to read / navigate</w:t>
+            </w:r>
+            <w:r>
+              <w:t>?</w:t>
+            </w:r>
+          </w:p>
         </w:tc>
       </w:tr>
     </w:tbl>
@@ -1867,6 +1879,7 @@
           </w:tcPr>
           <w:p>
             <w:r>
+              <w:lastRenderedPageBreak/>
               <w:t>Pre-test Question 2</w:t>
             </w:r>
           </w:p>
@@ -1891,7 +1904,6 @@
           </w:tcPr>
           <w:p>
             <w:r>
-              <w:lastRenderedPageBreak/>
               <w:t>Pre-test Question 3</w:t>
             </w:r>
           </w:p>
@@ -3470,6 +3482,26 @@
 </file>
 
 <file path=customXml/item1.xml><?xml version="1.0" encoding="utf-8"?>
+<p:properties xmlns:p="http://schemas.microsoft.com/office/2006/metadata/properties" xmlns:xsi="http://www.w3.org/2001/XMLSchema-instance" xmlns:pc="http://schemas.microsoft.com/office/infopath/2007/PartnerControls">
+  <documentManagement>
+    <TaxCatchAll xmlns="c64b295e-e158-430a-a9fe-95bbf17b9d7d" xsi:nil="true"/>
+    <lcf76f155ced4ddcb4097134ff3c332f xmlns="0f5e39c8-e5a1-4a0d-b53f-9134be983d19">
+      <Terms xmlns="http://schemas.microsoft.com/office/infopath/2007/PartnerControls"/>
+    </lcf76f155ced4ddcb4097134ff3c332f>
+  </documentManagement>
+</p:properties>
+</file>
+
+<file path=customXml/item2.xml><?xml version="1.0" encoding="utf-8"?>
+<?mso-contentType ?>
+<FormTemplates xmlns="http://schemas.microsoft.com/sharepoint/v3/contenttype/forms">
+  <Display>DocumentLibraryForm</Display>
+  <Edit>DocumentLibraryForm</Edit>
+  <New>DocumentLibraryForm</New>
+</FormTemplates>
+</file>
+
+<file path=customXml/item3.xml><?xml version="1.0" encoding="utf-8"?>
 <ct:contentTypeSchema xmlns:ct="http://schemas.microsoft.com/office/2006/metadata/contentType" xmlns:ma="http://schemas.microsoft.com/office/2006/metadata/properties/metaAttributes" ct:_="" ma:_="" ma:contentTypeName="Document" ma:contentTypeID="0x01010060D23BF17FCDC947B8E404D646247F8D" ma:contentTypeVersion="19" ma:contentTypeDescription="Create a new document." ma:contentTypeScope="" ma:versionID="956565ba73e342f7ff85743a54cdae39">
   <xsd:schema xmlns:xsd="http://www.w3.org/2001/XMLSchema" xmlns:xs="http://www.w3.org/2001/XMLSchema" xmlns:p="http://schemas.microsoft.com/office/2006/metadata/properties" xmlns:ns2="0f5e39c8-e5a1-4a0d-b53f-9134be983d19" xmlns:ns3="c64b295e-e158-430a-a9fe-95bbf17b9d7d" targetNamespace="http://schemas.microsoft.com/office/2006/metadata/properties" ma:root="true" ma:fieldsID="e69c52ee8cc74cf3ee061ba3b646cca7" ns2:_="" ns3:_="">
     <xsd:import namespace="0f5e39c8-e5a1-4a0d-b53f-9134be983d19"/>
@@ -3730,27 +3762,26 @@
 </ct:contentTypeSchema>
 </file>
 
-<file path=customXml/item2.xml><?xml version="1.0" encoding="utf-8"?>
-<?mso-contentType ?>
-<FormTemplates xmlns="http://schemas.microsoft.com/sharepoint/v3/contenttype/forms">
-  <Display>DocumentLibraryForm</Display>
-  <Edit>DocumentLibraryForm</Edit>
-  <New>DocumentLibraryForm</New>
-</FormTemplates>
+<file path=customXml/itemProps1.xml><?xml version="1.0" encoding="utf-8"?>
+<ds:datastoreItem xmlns:ds="http://schemas.openxmlformats.org/officeDocument/2006/customXml" ds:itemID="{CF606D7A-BC20-4455-9B94-4B6C9A54FF0C}">
+  <ds:schemaRefs>
+    <ds:schemaRef ds:uri="http://schemas.microsoft.com/office/2006/metadata/properties"/>
+    <ds:schemaRef ds:uri="http://schemas.microsoft.com/office/infopath/2007/PartnerControls"/>
+    <ds:schemaRef ds:uri="c64b295e-e158-430a-a9fe-95bbf17b9d7d"/>
+    <ds:schemaRef ds:uri="0f5e39c8-e5a1-4a0d-b53f-9134be983d19"/>
+  </ds:schemaRefs>
+</ds:datastoreItem>
 </file>
 
-<file path=customXml/item3.xml><?xml version="1.0" encoding="utf-8"?>
-<p:properties xmlns:p="http://schemas.microsoft.com/office/2006/metadata/properties" xmlns:xsi="http://www.w3.org/2001/XMLSchema-instance" xmlns:pc="http://schemas.microsoft.com/office/infopath/2007/PartnerControls">
-  <documentManagement>
-    <TaxCatchAll xmlns="c64b295e-e158-430a-a9fe-95bbf17b9d7d" xsi:nil="true"/>
-    <lcf76f155ced4ddcb4097134ff3c332f xmlns="0f5e39c8-e5a1-4a0d-b53f-9134be983d19">
-      <Terms xmlns="http://schemas.microsoft.com/office/infopath/2007/PartnerControls"/>
-    </lcf76f155ced4ddcb4097134ff3c332f>
-  </documentManagement>
-</p:properties>
+<file path=customXml/itemProps2.xml><?xml version="1.0" encoding="utf-8"?>
+<ds:datastoreItem xmlns:ds="http://schemas.openxmlformats.org/officeDocument/2006/customXml" ds:itemID="{C42D3E7F-AC3E-4EF4-AE01-81DADC54BE89}">
+  <ds:schemaRefs>
+    <ds:schemaRef ds:uri="http://schemas.microsoft.com/sharepoint/v3/contenttype/forms"/>
+  </ds:schemaRefs>
+</ds:datastoreItem>
 </file>
 
-<file path=customXml/itemProps1.xml><?xml version="1.0" encoding="utf-8"?>
+<file path=customXml/itemProps3.xml><?xml version="1.0" encoding="utf-8"?>
 <ds:datastoreItem xmlns:ds="http://schemas.openxmlformats.org/officeDocument/2006/customXml" ds:itemID="{D36D5B1A-B4CB-429A-9CC2-49D607767A2A}">
   <ds:schemaRefs>
     <ds:schemaRef ds:uri="http://schemas.microsoft.com/office/2006/metadata/contentType"/>
@@ -3767,23 +3798,4 @@
     <ds:schemaRef ds:uri="http://schemas.microsoft.com/internal/obd"/>
   </ds:schemaRefs>
 </ds:datastoreItem>
-</file>
-
-<file path=customXml/itemProps2.xml><?xml version="1.0" encoding="utf-8"?>
-<ds:datastoreItem xmlns:ds="http://schemas.openxmlformats.org/officeDocument/2006/customXml" ds:itemID="{C42D3E7F-AC3E-4EF4-AE01-81DADC54BE89}">
-  <ds:schemaRefs>
-    <ds:schemaRef ds:uri="http://schemas.microsoft.com/sharepoint/v3/contenttype/forms"/>
-  </ds:schemaRefs>
-</ds:datastoreItem>
-</file>
-
-<file path=customXml/itemProps3.xml><?xml version="1.0" encoding="utf-8"?>
-<ds:datastoreItem xmlns:ds="http://schemas.openxmlformats.org/officeDocument/2006/customXml" ds:itemID="{CF606D7A-BC20-4455-9B94-4B6C9A54FF0C}">
-  <ds:schemaRefs>
-    <ds:schemaRef ds:uri="http://schemas.microsoft.com/office/2006/metadata/properties"/>
-    <ds:schemaRef ds:uri="http://schemas.microsoft.com/office/infopath/2007/PartnerControls"/>
-    <ds:schemaRef ds:uri="c64b295e-e158-430a-a9fe-95bbf17b9d7d"/>
-    <ds:schemaRef ds:uri="0f5e39c8-e5a1-4a0d-b53f-9134be983d19"/>
-  </ds:schemaRefs>
-</ds:datastoreItem>
 </file>
</xml_diff>

<commit_message>
added everything mentioned in report not already
</commit_message>
<xml_diff>
--- a/a3/Report (2).docx
+++ b/a3/Report (2).docx
@@ -1381,9 +1381,108 @@
     </w:p>
     <w:p>
       <w:pPr>
+        <w:rPr>
+          <w:lang w:val="en-GB"/>
+        </w:rPr>
+      </w:pPr>
+    </w:p>
+    <w:p>
+      <w:pPr>
+        <w:rPr>
+          <w:lang w:val="en-GB"/>
+        </w:rPr>
+      </w:pPr>
+    </w:p>
+    <w:p>
+      <w:pPr>
+        <w:rPr>
+          <w:lang w:val="en-GB"/>
+        </w:rPr>
+      </w:pPr>
+    </w:p>
+    <w:p>
+      <w:pPr>
+        <w:rPr>
+          <w:lang w:val="en-GB"/>
+        </w:rPr>
+      </w:pPr>
+    </w:p>
+    <w:p>
+      <w:pPr>
+        <w:rPr>
+          <w:lang w:val="en-GB"/>
+        </w:rPr>
+      </w:pPr>
+    </w:p>
+    <w:p>
+      <w:pPr>
+        <w:rPr>
+          <w:lang w:val="en-GB"/>
+        </w:rPr>
+      </w:pPr>
+    </w:p>
+    <w:p>
+      <w:pPr>
+        <w:rPr>
+          <w:lang w:val="en-GB"/>
+        </w:rPr>
+      </w:pPr>
+    </w:p>
+    <w:p>
+      <w:pPr>
+        <w:rPr>
+          <w:lang w:val="en-GB"/>
+        </w:rPr>
+      </w:pPr>
+    </w:p>
+    <w:p>
+      <w:pPr>
+        <w:rPr>
+          <w:lang w:val="en-GB"/>
+        </w:rPr>
+      </w:pPr>
+    </w:p>
+    <w:p>
+      <w:pPr>
+        <w:rPr>
+          <w:lang w:val="en-GB"/>
+        </w:rPr>
+      </w:pPr>
+    </w:p>
+    <w:p>
+      <w:pPr>
+        <w:rPr>
+          <w:lang w:val="en-GB"/>
+        </w:rPr>
+      </w:pPr>
+    </w:p>
+    <w:p>
+      <w:pPr>
+        <w:rPr>
+          <w:lang w:val="en-GB"/>
+        </w:rPr>
+      </w:pPr>
+    </w:p>
+    <w:p>
+      <w:pPr>
+        <w:rPr>
+          <w:lang w:val="en-GB"/>
+        </w:rPr>
+      </w:pPr>
+    </w:p>
+    <w:p>
+      <w:pPr>
+        <w:rPr>
+          <w:lang w:val="en-GB"/>
+        </w:rPr>
+      </w:pPr>
+    </w:p>
+    <w:p>
+      <w:pPr>
         <w:pStyle w:val="Heading2"/>
       </w:pPr>
       <w:r>
+        <w:lastRenderedPageBreak/>
         <w:t>Usability Testing Results and Feedback</w:t>
       </w:r>
     </w:p>
@@ -1690,7 +1789,6 @@
           </w:tcPr>
           <w:p>
             <w:r>
-              <w:lastRenderedPageBreak/>
               <w:t>Task 2</w:t>
             </w:r>
           </w:p>
@@ -1910,6 +2008,9 @@
       </w:tr>
     </w:tbl>
     <w:p/>
+    <w:p/>
+    <w:p/>
+    <w:p/>
     <w:p>
       <w:pPr>
         <w:rPr>
@@ -1922,6 +2023,7 @@
           <w:b/>
           <w:bCs/>
         </w:rPr>
+        <w:lastRenderedPageBreak/>
         <w:t>User</w:t>
       </w:r>
       <w:r>
@@ -2063,7 +2165,11 @@
           <w:tcPr>
             <w:tcW w:w="3005" w:type="dxa"/>
           </w:tcPr>
-          <w:p/>
+          <w:p>
+            <w:r>
+              <w:t>Possibly Specsavers, other than that, never.</w:t>
+            </w:r>
+          </w:p>
         </w:tc>
         <w:tc>
           <w:tcPr>
@@ -2087,13 +2193,21 @@
           <w:tcPr>
             <w:tcW w:w="3005" w:type="dxa"/>
           </w:tcPr>
-          <w:p/>
+          <w:p>
+            <w:r>
+              <w:t>Interactive frame testing, professional appearance, ease of use, pricing info.</w:t>
+            </w:r>
+          </w:p>
         </w:tc>
         <w:tc>
           <w:tcPr>
             <w:tcW w:w="3006" w:type="dxa"/>
           </w:tcPr>
-          <w:p/>
+          <w:p>
+            <w:r>
+              <w:t>Can’t do much of this; no pricing info included in email, and I’m not bright enough to personally code an interactive frame tester.</w:t>
+            </w:r>
+          </w:p>
         </w:tc>
       </w:tr>
       <w:tr>
@@ -2111,13 +2225,21 @@
           <w:tcPr>
             <w:tcW w:w="3005" w:type="dxa"/>
           </w:tcPr>
-          <w:p/>
+          <w:p>
+            <w:r>
+              <w:t>Price, value and nothing unexpected.</w:t>
+            </w:r>
+          </w:p>
         </w:tc>
         <w:tc>
           <w:tcPr>
             <w:tcW w:w="3006" w:type="dxa"/>
           </w:tcPr>
-          <w:p/>
+          <w:p>
+            <w:r>
+              <w:t>Can’t do much to include pricing/value.</w:t>
+            </w:r>
+          </w:p>
         </w:tc>
       </w:tr>
       <w:tr>
@@ -2135,7 +2257,14 @@
           <w:tcPr>
             <w:tcW w:w="3005" w:type="dxa"/>
           </w:tcPr>
-          <w:p/>
+          <w:p>
+            <w:r>
+              <w:t xml:space="preserve">Scrolled around, traversed pages, mentioned professional appearance and </w:t>
+            </w:r>
+            <w:r>
+              <w:t>pretty easy to use.</w:t>
+            </w:r>
+          </w:p>
         </w:tc>
         <w:tc>
           <w:tcPr>
@@ -2159,7 +2288,11 @@
           <w:tcPr>
             <w:tcW w:w="3005" w:type="dxa"/>
           </w:tcPr>
-          <w:p/>
+          <w:p>
+            <w:r>
+              <w:t>Located ‘why eyecare matters’ on nav, skimmed through. Pointed out the extra booking button.</w:t>
+            </w:r>
+          </w:p>
         </w:tc>
         <w:tc>
           <w:tcPr>
@@ -2183,13 +2316,24 @@
           <w:tcPr>
             <w:tcW w:w="3005" w:type="dxa"/>
           </w:tcPr>
+          <w:p>
+            <w:r>
+              <w:t>Went straight to services on the top sticky nav and found the OCT section. Commented on the ‘your team,’ said it is usually ‘our team.’</w:t>
+            </w:r>
+          </w:p>
           <w:p/>
+          <w:p/>
+          <w:p/>
         </w:tc>
         <w:tc>
           <w:tcPr>
             <w:tcW w:w="3006" w:type="dxa"/>
           </w:tcPr>
-          <w:p/>
+          <w:p>
+            <w:r>
+              <w:t>Looking into this, it seems quite 50/50 as to whether businesses say ‘your team’ or ‘our team.’</w:t>
+            </w:r>
+          </w:p>
         </w:tc>
       </w:tr>
       <w:tr>
@@ -2207,13 +2351,30 @@
           <w:tcPr>
             <w:tcW w:w="3005" w:type="dxa"/>
           </w:tcPr>
-          <w:p/>
+          <w:p>
+            <w:r>
+              <w:t>Went to ‘book appointment’ and went through the form before being prompted to pick who the booking was for (yourself vs dependent). Said “why do I have to do that”</w:t>
+            </w:r>
+            <w:r>
+              <w:t>, before finishing booking inputs</w:t>
+            </w:r>
+            <w:r>
+              <w:t>.</w:t>
+            </w:r>
+          </w:p>
         </w:tc>
         <w:tc>
           <w:tcPr>
             <w:tcW w:w="3006" w:type="dxa"/>
           </w:tcPr>
-          <w:p/>
+          <w:p>
+            <w:r>
+              <w:t>After some looking into it, most businesses don’t offer this feature – you presumably just put the dependents info in place of yours</w:t>
+            </w:r>
+            <w:r>
+              <w:t>.</w:t>
+            </w:r>
+          </w:p>
         </w:tc>
       </w:tr>
       <w:tr>
@@ -2240,13 +2401,27 @@
           <w:tcPr>
             <w:tcW w:w="3005" w:type="dxa"/>
           </w:tcPr>
-          <w:p/>
+          <w:p>
+            <w:r>
+              <w:t>Yes, everything was where expected. Commented on wanting pricing guides again.</w:t>
+            </w:r>
+          </w:p>
         </w:tc>
         <w:tc>
           <w:tcPr>
             <w:tcW w:w="3006" w:type="dxa"/>
           </w:tcPr>
-          <w:p/>
+          <w:p>
+            <w:r>
+              <w:t xml:space="preserve">Pricing is also not commonplace on these </w:t>
+            </w:r>
+            <w:r>
+              <w:t>sites and</w:t>
+            </w:r>
+            <w:r>
+              <w:t xml:space="preserve"> was not provided.</w:t>
+            </w:r>
+          </w:p>
         </w:tc>
       </w:tr>
       <w:tr>
@@ -2273,13 +2448,24 @@
           <w:tcPr>
             <w:tcW w:w="3005" w:type="dxa"/>
           </w:tcPr>
-          <w:p/>
+          <w:p>
+            <w:r>
+              <w:t>100%, but might want contact info in the nav itself to save finding it in the booking form.</w:t>
+            </w:r>
+          </w:p>
         </w:tc>
         <w:tc>
           <w:tcPr>
             <w:tcW w:w="3006" w:type="dxa"/>
           </w:tcPr>
-          <w:p/>
+          <w:p>
+            <w:r>
+              <w:t>May be able to include above / below the appointment button</w:t>
+            </w:r>
+            <w:r>
+              <w:t>.</w:t>
+            </w:r>
+          </w:p>
         </w:tc>
       </w:tr>
       <w:tr>
@@ -2306,7 +2492,11 @@
           <w:tcPr>
             <w:tcW w:w="3005" w:type="dxa"/>
           </w:tcPr>
-          <w:p/>
+          <w:p>
+            <w:r>
+              <w:t>“I like it, I think it goes well for this type of thing”</w:t>
+            </w:r>
+          </w:p>
         </w:tc>
         <w:tc>
           <w:tcPr>
@@ -2317,11 +2507,16 @@
       </w:tr>
     </w:tbl>
     <w:p/>
+    <w:p/>
+    <w:p/>
+    <w:p/>
+    <w:p/>
     <w:p>
       <w:pPr>
         <w:pStyle w:val="Heading2"/>
       </w:pPr>
       <w:r>
+        <w:lastRenderedPageBreak/>
         <w:t xml:space="preserve">Response to Usability </w:t>
       </w:r>
       <w:r>
@@ -2365,18 +2560,88 @@
         <w:pStyle w:val="ListParagraph"/>
         <w:numPr>
           <w:ilvl w:val="0"/>
-          <w:numId w:val="3"/>
+          <w:numId w:val="6"/>
         </w:numPr>
       </w:pPr>
       <w:r>
-        <w:t>…</w:t>
-      </w:r>
-    </w:p>
+        <w:t>The first thing would be to remove the proposed checkboxes for ‘yourself’ vs ‘dependent.’ This was picked by one interviewee as something they weren’t used to, and other, larger optometry companies do not have this in their booking system, so it should be gone.</w:t>
+      </w:r>
+    </w:p>
+    <w:p>
+      <w:pPr>
+        <w:pStyle w:val="ListParagraph"/>
+        <w:numPr>
+          <w:ilvl w:val="0"/>
+          <w:numId w:val="6"/>
+        </w:numPr>
+      </w:pPr>
+      <w:r>
+        <w:t>Possibly some more ‘call to action’ pieces need to be in place to make the content more desirable. Both testers seemed to skim the content rather than read it, though neither requires actual eyecare now, perhaps some titles could be changed to ‘jump out.’</w:t>
+      </w:r>
+    </w:p>
+    <w:p>
+      <w:pPr>
+        <w:pStyle w:val="ListParagraph"/>
+        <w:numPr>
+          <w:ilvl w:val="0"/>
+          <w:numId w:val="6"/>
+        </w:numPr>
+      </w:pPr>
+      <w:r>
+        <w:t>The first tester mentioned the plethora of information on the site (all of which is essentially required to be used, as per the ‘email’), so perhaps greater padding and margins need to be implemented.</w:t>
+      </w:r>
+    </w:p>
+    <w:p>
+      <w:pPr>
+        <w:pStyle w:val="ListParagraph"/>
+        <w:numPr>
+          <w:ilvl w:val="0"/>
+          <w:numId w:val="6"/>
+        </w:numPr>
+      </w:pPr>
+      <w:r>
+        <w:t>The idea of affordability was heavily pushed by the second tested, so perhaps messaging related to money and discounts needs to be in the forefront even more so. Recolouring text that mentions discounts may help this, even if we can’t display real prices etc. in the way that he would like.</w:t>
+      </w:r>
+    </w:p>
+    <w:p>
+      <w:pPr>
+        <w:pStyle w:val="ListParagraph"/>
+        <w:numPr>
+          <w:ilvl w:val="0"/>
+          <w:numId w:val="6"/>
+        </w:numPr>
+      </w:pPr>
+      <w:r>
+        <w:t>Including contact info in the nav may be a better way for people who just want to call in or email to contact Vcare, the same way tester 2 felt this was missing when he viewed the site. This feature is seen on another major optometrist provider who has their 1800 number plastered to the top nav.</w:t>
+      </w:r>
+    </w:p>
+    <w:p/>
+    <w:p/>
+    <w:p/>
+    <w:p/>
+    <w:p/>
+    <w:p/>
+    <w:p/>
+    <w:p/>
+    <w:p/>
+    <w:p/>
+    <w:p/>
+    <w:p/>
+    <w:p/>
+    <w:p/>
+    <w:p/>
+    <w:p/>
+    <w:p/>
+    <w:p/>
+    <w:p/>
+    <w:p/>
+    <w:p/>
     <w:p>
       <w:pPr>
         <w:pStyle w:val="Heading2"/>
       </w:pPr>
       <w:r>
+        <w:lastRenderedPageBreak/>
         <w:t>References</w:t>
       </w:r>
     </w:p>
@@ -2454,19 +2719,7 @@
           <w:rPr>
             <w:rStyle w:val="Hyperlink"/>
           </w:rPr>
-          <w:t>Man</w:t>
-        </w:r>
-        <w:r>
-          <w:rPr>
-            <w:rStyle w:val="Hyperlink"/>
-          </w:rPr>
-          <w:t>s</w:t>
-        </w:r>
-        <w:r>
-          <w:rPr>
-            <w:rStyle w:val="Hyperlink"/>
-          </w:rPr>
-          <w:t>imar</w:t>
+          <w:t>Mansimar</w:t>
         </w:r>
         <w:proofErr w:type="spellEnd"/>
         <w:r>
@@ -2573,6 +2826,118 @@
       </w:pPr>
       <w:r>
         <w:t>Used for style ideas</w:t>
+      </w:r>
+    </w:p>
+    <w:p>
+      <w:pPr>
+        <w:pStyle w:val="ListParagraph"/>
+        <w:numPr>
+          <w:ilvl w:val="0"/>
+          <w:numId w:val="4"/>
+        </w:numPr>
+      </w:pPr>
+      <w:hyperlink r:id="rId14" w:history="1">
+        <w:r>
+          <w:rPr>
+            <w:rStyle w:val="Hyperlink"/>
+          </w:rPr>
+          <w:t>https://stackoverflow.com/questions/54993540/how-to-make-certain-dates-unavailable-within-html-date-form</w:t>
+        </w:r>
+      </w:hyperlink>
+      <w:r>
+        <w:t xml:space="preserve"> </w:t>
+      </w:r>
+    </w:p>
+    <w:p>
+      <w:pPr>
+        <w:pStyle w:val="ListParagraph"/>
+      </w:pPr>
+      <w:r>
+        <w:t>For setting the date input to work correctly</w:t>
+      </w:r>
+    </w:p>
+    <w:p>
+      <w:pPr>
+        <w:pStyle w:val="ListParagraph"/>
+        <w:numPr>
+          <w:ilvl w:val="0"/>
+          <w:numId w:val="4"/>
+        </w:numPr>
+      </w:pPr>
+      <w:hyperlink r:id="rId15" w:history="1">
+        <w:r>
+          <w:rPr>
+            <w:rStyle w:val="Hyperlink"/>
+          </w:rPr>
+          <w:t>https://stackoverflow.com/questions/35605734/formatting-the-time-input-field-with-html</w:t>
+        </w:r>
+      </w:hyperlink>
+      <w:r>
+        <w:t xml:space="preserve"> </w:t>
+      </w:r>
+    </w:p>
+    <w:p>
+      <w:pPr>
+        <w:pStyle w:val="ListParagraph"/>
+      </w:pPr>
+      <w:r>
+        <w:t xml:space="preserve">For setting the time input correctly </w:t>
+      </w:r>
+    </w:p>
+    <w:p>
+      <w:pPr>
+        <w:pStyle w:val="ListParagraph"/>
+        <w:numPr>
+          <w:ilvl w:val="0"/>
+          <w:numId w:val="4"/>
+        </w:numPr>
+      </w:pPr>
+      <w:hyperlink r:id="rId16" w:history="1">
+        <w:r>
+          <w:rPr>
+            <w:rStyle w:val="Hyperlink"/>
+          </w:rPr>
+          <w:t>https://stackoverflow.com/questions/17219688/href-tel-and-mobile-numbers</w:t>
+        </w:r>
+      </w:hyperlink>
+      <w:r>
+        <w:t xml:space="preserve"> </w:t>
+      </w:r>
+    </w:p>
+    <w:p>
+      <w:pPr>
+        <w:pStyle w:val="ListParagraph"/>
+      </w:pPr>
+      <w:r>
+        <w:t>for setting up telephone number inputs correctly</w:t>
+      </w:r>
+    </w:p>
+    <w:p>
+      <w:pPr>
+        <w:pStyle w:val="ListParagraph"/>
+        <w:numPr>
+          <w:ilvl w:val="0"/>
+          <w:numId w:val="4"/>
+        </w:numPr>
+      </w:pPr>
+      <w:hyperlink r:id="rId17" w:history="1">
+        <w:r>
+          <w:rPr>
+            <w:rStyle w:val="Hyperlink"/>
+          </w:rPr>
+          <w:t>https://stackoverflow.com/questions/4888377/how-to-add-a-browser-tab-icon-favicon-for-a-website</w:t>
+        </w:r>
+      </w:hyperlink>
+      <w:r>
+        <w:t xml:space="preserve"> </w:t>
+      </w:r>
+    </w:p>
+    <w:p>
+      <w:pPr>
+        <w:pStyle w:val="ListParagraph"/>
+      </w:pPr>
+      <w:r>
+        <w:t>To help properly input the website icon</w:t>
       </w:r>
     </w:p>
     <w:sectPr>
@@ -2701,6 +3066,95 @@
     </w:lvl>
   </w:abstractNum>
   <w:abstractNum w:abstractNumId="1" w15:restartNumberingAfterBreak="0">
+    <w:nsid w:val="1FEF579C"/>
+    <w:multiLevelType w:val="hybridMultilevel"/>
+    <w:tmpl w:val="62C470B6"/>
+    <w:lvl w:ilvl="0" w:tplc="0C09000F">
+      <w:start w:val="1"/>
+      <w:numFmt w:val="decimal"/>
+      <w:lvlText w:val="%1."/>
+      <w:lvlJc w:val="left"/>
+      <w:pPr>
+        <w:ind w:left="720" w:hanging="360"/>
+      </w:pPr>
+      <w:rPr>
+        <w:rFonts w:hint="default"/>
+      </w:rPr>
+    </w:lvl>
+    <w:lvl w:ilvl="1" w:tplc="0C090019" w:tentative="1">
+      <w:start w:val="1"/>
+      <w:numFmt w:val="lowerLetter"/>
+      <w:lvlText w:val="%2."/>
+      <w:lvlJc w:val="left"/>
+      <w:pPr>
+        <w:ind w:left="1440" w:hanging="360"/>
+      </w:pPr>
+    </w:lvl>
+    <w:lvl w:ilvl="2" w:tplc="0C09001B" w:tentative="1">
+      <w:start w:val="1"/>
+      <w:numFmt w:val="lowerRoman"/>
+      <w:lvlText w:val="%3."/>
+      <w:lvlJc w:val="right"/>
+      <w:pPr>
+        <w:ind w:left="2160" w:hanging="180"/>
+      </w:pPr>
+    </w:lvl>
+    <w:lvl w:ilvl="3" w:tplc="0C09000F" w:tentative="1">
+      <w:start w:val="1"/>
+      <w:numFmt w:val="decimal"/>
+      <w:lvlText w:val="%4."/>
+      <w:lvlJc w:val="left"/>
+      <w:pPr>
+        <w:ind w:left="2880" w:hanging="360"/>
+      </w:pPr>
+    </w:lvl>
+    <w:lvl w:ilvl="4" w:tplc="0C090019" w:tentative="1">
+      <w:start w:val="1"/>
+      <w:numFmt w:val="lowerLetter"/>
+      <w:lvlText w:val="%5."/>
+      <w:lvlJc w:val="left"/>
+      <w:pPr>
+        <w:ind w:left="3600" w:hanging="360"/>
+      </w:pPr>
+    </w:lvl>
+    <w:lvl w:ilvl="5" w:tplc="0C09001B" w:tentative="1">
+      <w:start w:val="1"/>
+      <w:numFmt w:val="lowerRoman"/>
+      <w:lvlText w:val="%6."/>
+      <w:lvlJc w:val="right"/>
+      <w:pPr>
+        <w:ind w:left="4320" w:hanging="180"/>
+      </w:pPr>
+    </w:lvl>
+    <w:lvl w:ilvl="6" w:tplc="0C09000F" w:tentative="1">
+      <w:start w:val="1"/>
+      <w:numFmt w:val="decimal"/>
+      <w:lvlText w:val="%7."/>
+      <w:lvlJc w:val="left"/>
+      <w:pPr>
+        <w:ind w:left="5040" w:hanging="360"/>
+      </w:pPr>
+    </w:lvl>
+    <w:lvl w:ilvl="7" w:tplc="0C090019" w:tentative="1">
+      <w:start w:val="1"/>
+      <w:numFmt w:val="lowerLetter"/>
+      <w:lvlText w:val="%8."/>
+      <w:lvlJc w:val="left"/>
+      <w:pPr>
+        <w:ind w:left="5760" w:hanging="360"/>
+      </w:pPr>
+    </w:lvl>
+    <w:lvl w:ilvl="8" w:tplc="0C09001B" w:tentative="1">
+      <w:start w:val="1"/>
+      <w:numFmt w:val="lowerRoman"/>
+      <w:lvlText w:val="%9."/>
+      <w:lvlJc w:val="right"/>
+      <w:pPr>
+        <w:ind w:left="6480" w:hanging="180"/>
+      </w:pPr>
+    </w:lvl>
+  </w:abstractNum>
+  <w:abstractNum w:abstractNumId="2" w15:restartNumberingAfterBreak="0">
     <w:nsid w:val="270B00B7"/>
     <w:multiLevelType w:val="hybridMultilevel"/>
     <w:tmpl w:val="F6E4326E"/>
@@ -2786,7 +3240,7 @@
       </w:pPr>
     </w:lvl>
   </w:abstractNum>
-  <w:abstractNum w:abstractNumId="2" w15:restartNumberingAfterBreak="0">
+  <w:abstractNum w:abstractNumId="3" w15:restartNumberingAfterBreak="0">
     <w:nsid w:val="66E36162"/>
     <w:multiLevelType w:val="hybridMultilevel"/>
     <w:tmpl w:val="F6E4326E"/>
@@ -2872,7 +3326,7 @@
       </w:pPr>
     </w:lvl>
   </w:abstractNum>
-  <w:abstractNum w:abstractNumId="3" w15:restartNumberingAfterBreak="0">
+  <w:abstractNum w:abstractNumId="4" w15:restartNumberingAfterBreak="0">
     <w:nsid w:val="700A73BE"/>
     <w:multiLevelType w:val="hybridMultilevel"/>
     <w:tmpl w:val="A518FF1A"/>
@@ -2985,17 +3439,112 @@
       </w:rPr>
     </w:lvl>
   </w:abstractNum>
+  <w:abstractNum w:abstractNumId="5" w15:restartNumberingAfterBreak="0">
+    <w:nsid w:val="7116386E"/>
+    <w:multiLevelType w:val="hybridMultilevel"/>
+    <w:tmpl w:val="5ADC2496"/>
+    <w:lvl w:ilvl="0" w:tplc="F03CF1AE">
+      <w:start w:val="1"/>
+      <w:numFmt w:val="decimal"/>
+      <w:lvlText w:val="%1."/>
+      <w:lvlJc w:val="left"/>
+      <w:pPr>
+        <w:ind w:left="1080" w:hanging="360"/>
+      </w:pPr>
+      <w:rPr>
+        <w:rFonts w:hint="default"/>
+      </w:rPr>
+    </w:lvl>
+    <w:lvl w:ilvl="1" w:tplc="0C090019" w:tentative="1">
+      <w:start w:val="1"/>
+      <w:numFmt w:val="lowerLetter"/>
+      <w:lvlText w:val="%2."/>
+      <w:lvlJc w:val="left"/>
+      <w:pPr>
+        <w:ind w:left="1800" w:hanging="360"/>
+      </w:pPr>
+    </w:lvl>
+    <w:lvl w:ilvl="2" w:tplc="0C09001B" w:tentative="1">
+      <w:start w:val="1"/>
+      <w:numFmt w:val="lowerRoman"/>
+      <w:lvlText w:val="%3."/>
+      <w:lvlJc w:val="right"/>
+      <w:pPr>
+        <w:ind w:left="2520" w:hanging="180"/>
+      </w:pPr>
+    </w:lvl>
+    <w:lvl w:ilvl="3" w:tplc="0C09000F" w:tentative="1">
+      <w:start w:val="1"/>
+      <w:numFmt w:val="decimal"/>
+      <w:lvlText w:val="%4."/>
+      <w:lvlJc w:val="left"/>
+      <w:pPr>
+        <w:ind w:left="3240" w:hanging="360"/>
+      </w:pPr>
+    </w:lvl>
+    <w:lvl w:ilvl="4" w:tplc="0C090019" w:tentative="1">
+      <w:start w:val="1"/>
+      <w:numFmt w:val="lowerLetter"/>
+      <w:lvlText w:val="%5."/>
+      <w:lvlJc w:val="left"/>
+      <w:pPr>
+        <w:ind w:left="3960" w:hanging="360"/>
+      </w:pPr>
+    </w:lvl>
+    <w:lvl w:ilvl="5" w:tplc="0C09001B" w:tentative="1">
+      <w:start w:val="1"/>
+      <w:numFmt w:val="lowerRoman"/>
+      <w:lvlText w:val="%6."/>
+      <w:lvlJc w:val="right"/>
+      <w:pPr>
+        <w:ind w:left="4680" w:hanging="180"/>
+      </w:pPr>
+    </w:lvl>
+    <w:lvl w:ilvl="6" w:tplc="0C09000F" w:tentative="1">
+      <w:start w:val="1"/>
+      <w:numFmt w:val="decimal"/>
+      <w:lvlText w:val="%7."/>
+      <w:lvlJc w:val="left"/>
+      <w:pPr>
+        <w:ind w:left="5400" w:hanging="360"/>
+      </w:pPr>
+    </w:lvl>
+    <w:lvl w:ilvl="7" w:tplc="0C090019" w:tentative="1">
+      <w:start w:val="1"/>
+      <w:numFmt w:val="lowerLetter"/>
+      <w:lvlText w:val="%8."/>
+      <w:lvlJc w:val="left"/>
+      <w:pPr>
+        <w:ind w:left="6120" w:hanging="360"/>
+      </w:pPr>
+    </w:lvl>
+    <w:lvl w:ilvl="8" w:tplc="0C09001B" w:tentative="1">
+      <w:start w:val="1"/>
+      <w:numFmt w:val="lowerRoman"/>
+      <w:lvlText w:val="%9."/>
+      <w:lvlJc w:val="right"/>
+      <w:pPr>
+        <w:ind w:left="6840" w:hanging="180"/>
+      </w:pPr>
+    </w:lvl>
+  </w:abstractNum>
   <w:num w:numId="1" w16cid:durableId="1597636826">
-    <w:abstractNumId w:val="3"/>
+    <w:abstractNumId w:val="4"/>
   </w:num>
   <w:num w:numId="2" w16cid:durableId="923102201">
     <w:abstractNumId w:val="0"/>
   </w:num>
   <w:num w:numId="3" w16cid:durableId="1813793140">
-    <w:abstractNumId w:val="1"/>
+    <w:abstractNumId w:val="2"/>
   </w:num>
   <w:num w:numId="4" w16cid:durableId="1177690230">
-    <w:abstractNumId w:val="2"/>
+    <w:abstractNumId w:val="3"/>
+  </w:num>
+  <w:num w:numId="5" w16cid:durableId="87042393">
+    <w:abstractNumId w:val="5"/>
+  </w:num>
+  <w:num w:numId="6" w16cid:durableId="358629991">
+    <w:abstractNumId w:val="1"/>
   </w:num>
 </w:numbering>
 </file>
@@ -3873,15 +4422,6 @@
 </file>
 
 <file path=customXml/item1.xml><?xml version="1.0" encoding="utf-8"?>
-<?mso-contentType ?>
-<FormTemplates xmlns="http://schemas.microsoft.com/sharepoint/v3/contenttype/forms">
-  <Display>DocumentLibraryForm</Display>
-  <Edit>DocumentLibraryForm</Edit>
-  <New>DocumentLibraryForm</New>
-</FormTemplates>
-</file>
-
-<file path=customXml/item2.xml><?xml version="1.0" encoding="utf-8"?>
 <ct:contentTypeSchema xmlns:ct="http://schemas.microsoft.com/office/2006/metadata/contentType" xmlns:ma="http://schemas.microsoft.com/office/2006/metadata/properties/metaAttributes" ct:_="" ma:_="" ma:contentTypeName="Document" ma:contentTypeID="0x01010060D23BF17FCDC947B8E404D646247F8D" ma:contentTypeVersion="19" ma:contentTypeDescription="Create a new document." ma:contentTypeScope="" ma:versionID="956565ba73e342f7ff85743a54cdae39">
   <xsd:schema xmlns:xsd="http://www.w3.org/2001/XMLSchema" xmlns:xs="http://www.w3.org/2001/XMLSchema" xmlns:p="http://schemas.microsoft.com/office/2006/metadata/properties" xmlns:ns2="0f5e39c8-e5a1-4a0d-b53f-9134be983d19" xmlns:ns3="c64b295e-e158-430a-a9fe-95bbf17b9d7d" targetNamespace="http://schemas.microsoft.com/office/2006/metadata/properties" ma:root="true" ma:fieldsID="e69c52ee8cc74cf3ee061ba3b646cca7" ns2:_="" ns3:_="">
     <xsd:import namespace="0f5e39c8-e5a1-4a0d-b53f-9134be983d19"/>
@@ -4142,7 +4682,7 @@
 </ct:contentTypeSchema>
 </file>
 
-<file path=customXml/item3.xml><?xml version="1.0" encoding="utf-8"?>
+<file path=customXml/item2.xml><?xml version="1.0" encoding="utf-8"?>
 <p:properties xmlns:p="http://schemas.microsoft.com/office/2006/metadata/properties" xmlns:xsi="http://www.w3.org/2001/XMLSchema-instance" xmlns:pc="http://schemas.microsoft.com/office/infopath/2007/PartnerControls">
   <documentManagement>
     <TaxCatchAll xmlns="c64b295e-e158-430a-a9fe-95bbf17b9d7d" xsi:nil="true"/>
@@ -4153,15 +4693,16 @@
 </p:properties>
 </file>
 
-<file path=customXml/itemProps1.xml><?xml version="1.0" encoding="utf-8"?>
-<ds:datastoreItem xmlns:ds="http://schemas.openxmlformats.org/officeDocument/2006/customXml" ds:itemID="{C42D3E7F-AC3E-4EF4-AE01-81DADC54BE89}">
-  <ds:schemaRefs>
-    <ds:schemaRef ds:uri="http://schemas.microsoft.com/sharepoint/v3/contenttype/forms"/>
-  </ds:schemaRefs>
-</ds:datastoreItem>
+<file path=customXml/item3.xml><?xml version="1.0" encoding="utf-8"?>
+<?mso-contentType ?>
+<FormTemplates xmlns="http://schemas.microsoft.com/sharepoint/v3/contenttype/forms">
+  <Display>DocumentLibraryForm</Display>
+  <Edit>DocumentLibraryForm</Edit>
+  <New>DocumentLibraryForm</New>
+</FormTemplates>
 </file>
 
-<file path=customXml/itemProps2.xml><?xml version="1.0" encoding="utf-8"?>
+<file path=customXml/itemProps1.xml><?xml version="1.0" encoding="utf-8"?>
 <ds:datastoreItem xmlns:ds="http://schemas.openxmlformats.org/officeDocument/2006/customXml" ds:itemID="{D36D5B1A-B4CB-429A-9CC2-49D607767A2A}">
   <ds:schemaRefs>
     <ds:schemaRef ds:uri="http://schemas.microsoft.com/office/2006/metadata/contentType"/>
@@ -4180,7 +4721,7 @@
 </ds:datastoreItem>
 </file>
 
-<file path=customXml/itemProps3.xml><?xml version="1.0" encoding="utf-8"?>
+<file path=customXml/itemProps2.xml><?xml version="1.0" encoding="utf-8"?>
 <ds:datastoreItem xmlns:ds="http://schemas.openxmlformats.org/officeDocument/2006/customXml" ds:itemID="{CF606D7A-BC20-4455-9B94-4B6C9A54FF0C}">
   <ds:schemaRefs>
     <ds:schemaRef ds:uri="http://schemas.microsoft.com/office/2006/metadata/properties"/>
@@ -4189,4 +4730,12 @@
     <ds:schemaRef ds:uri="0f5e39c8-e5a1-4a0d-b53f-9134be983d19"/>
   </ds:schemaRefs>
 </ds:datastoreItem>
+</file>
+
+<file path=customXml/itemProps3.xml><?xml version="1.0" encoding="utf-8"?>
+<ds:datastoreItem xmlns:ds="http://schemas.openxmlformats.org/officeDocument/2006/customXml" ds:itemID="{C42D3E7F-AC3E-4EF4-AE01-81DADC54BE89}">
+  <ds:schemaRefs>
+    <ds:schemaRef ds:uri="http://schemas.microsoft.com/sharepoint/v3/contenttype/forms"/>
+  </ds:schemaRefs>
+</ds:datastoreItem>
 </file>
</xml_diff>